<commit_message>
v1.13.9: Docs menu: the three training guides under Data Ingest; hierarchical CSV guide links its training video
</commit_message>
<xml_diff>
--- a/docs/training-hierarchical-csv-import.docx
+++ b/docs/training-hierarchical-csv-import.docx
@@ -509,7 +509,18 @@
         <w:pStyle w:val="BodyText"/>
       </w:pPr>
       <w:r>
-        <w:t xml:space="preserve">This guide goes with the training video of the same name. It takes you through one complete import: a small fonds with two series, three files and an item, built from a single CSV file. You make one deliberate mistake on the way and fix it, so that you know what to do when it happens with your own data.</w:t>
+        <w:t xml:space="preserve">This guide goes with the training video of the same name (</w:t>
+      </w:r>
+      <w:hyperlink r:id="rId20">
+        <w:r>
+          <w:rPr>
+            <w:rStyle w:val="Hyperlink"/>
+          </w:rPr>
+          <w:t xml:space="preserve">watch on YouTube</w:t>
+        </w:r>
+      </w:hyperlink>
+      <w:r>
+        <w:t xml:space="preserve">). It takes you through one complete import: a small fonds with two series, three files and an item, built from a single CSV file. You make one deliberate mistake on the way and fix it, so that you know what to do when it happens with your own data.</w:t>
       </w:r>
     </w:p>
     <w:p>
@@ -520,7 +531,7 @@
         <w:t xml:space="preserve">Allow about 20 minutes to work through it with the practice file.</w:t>
       </w:r>
     </w:p>
-    <w:bookmarkStart w:id="20" w:name="before-you-start"/>
+    <w:bookmarkStart w:id="21" w:name="before-you-start"/>
     <w:p>
       <w:pPr>
         <w:pStyle w:val="Heading2"/>
@@ -709,8 +720,8 @@
         <w:t xml:space="preserve">).</w:t>
       </w:r>
     </w:p>
-    <w:bookmarkEnd w:id="20"/>
-    <w:bookmarkStart w:id="27" w:name="prepare-the-csv"/>
+    <w:bookmarkEnd w:id="21"/>
+    <w:bookmarkStart w:id="28" w:name="prepare-the-csv"/>
     <w:p>
       <w:pPr>
         <w:pStyle w:val="Heading2"/>
@@ -1149,18 +1160,18 @@
           <wp:inline>
             <wp:extent cx="5778500" cy="3250406"/>
             <wp:effectExtent b="0" l="0" r="0" t="0"/>
-            <wp:docPr descr="The fonds row: its parentId is empty because nothing sits above it." title="" id="22" name="Picture"/>
+            <wp:docPr descr="The fonds row: its parentId is empty because nothing sits above it." title="" id="23" name="Picture"/>
             <a:graphic>
               <a:graphicData uri="http://schemas.openxmlformats.org/drawingml/2006/picture">
                 <pic:pic>
                   <pic:nvPicPr>
-                    <pic:cNvPr descr="images/training-hierarchical-csv/01-csv-fonds.png" id="23" name="Picture"/>
+                    <pic:cNvPr descr="images/training-hierarchical-csv/01-csv-fonds.png" id="24" name="Picture"/>
                     <pic:cNvPicPr>
                       <a:picLocks noChangeArrowheads="1" noChangeAspect="1"/>
                     </pic:cNvPicPr>
                   </pic:nvPicPr>
                   <pic:blipFill>
-                    <a:blip r:embed="rId21"/>
+                    <a:blip r:embed="rId22"/>
                     <a:stretch>
                       <a:fillRect/>
                     </a:stretch>
@@ -1284,18 +1295,18 @@
           <wp:inline>
             <wp:extent cx="5778500" cy="3250406"/>
             <wp:effectExtent b="0" l="0" r="0" t="0"/>
-            <wp:docPr descr="Row 8 has a deliberate mistake: its parentId is GF-G, which does not exist." title="" id="25" name="Picture"/>
+            <wp:docPr descr="Row 8 has a deliberate mistake: its parentId is GF-G, which does not exist." title="" id="26" name="Picture"/>
             <a:graphic>
               <a:graphicData uri="http://schemas.openxmlformats.org/drawingml/2006/picture">
                 <pic:pic>
                   <pic:nvPicPr>
-                    <pic:cNvPr descr="images/training-hierarchical-csv/02-csv-mistake.png" id="26" name="Picture"/>
+                    <pic:cNvPr descr="images/training-hierarchical-csv/02-csv-mistake.png" id="27" name="Picture"/>
                     <pic:cNvPicPr>
                       <a:picLocks noChangeArrowheads="1" noChangeAspect="1"/>
                     </pic:cNvPicPr>
                   </pic:nvPicPr>
                   <pic:blipFill>
-                    <a:blip r:embed="rId24"/>
+                    <a:blip r:embed="rId25"/>
                     <a:stretch>
                       <a:fillRect/>
                     </a:stretch>
@@ -1380,8 +1391,8 @@
         <w:t xml:space="preserve">. In Excel: File &gt; Save As &gt; CSV UTF-8. Other CSV types can garble accented characters.</w:t>
       </w:r>
     </w:p>
-    <w:bookmarkEnd w:id="27"/>
-    <w:bookmarkStart w:id="37" w:name="start-a-new-ingest"/>
+    <w:bookmarkEnd w:id="28"/>
+    <w:bookmarkStart w:id="38" w:name="start-a-new-ingest"/>
     <w:p>
       <w:pPr>
         <w:pStyle w:val="Heading2"/>
@@ -1465,18 +1476,18 @@
           <wp:inline>
             <wp:extent cx="5778500" cy="3250406"/>
             <wp:effectExtent b="0" l="0" r="0" t="0"/>
-            <wp:docPr descr="AHG Plugins menu &gt; Data Ingest &gt; New Ingest." title="" id="29" name="Picture"/>
+            <wp:docPr descr="AHG Plugins menu &gt; Data Ingest &gt; New Ingest." title="" id="30" name="Picture"/>
             <a:graphic>
               <a:graphicData uri="http://schemas.openxmlformats.org/drawingml/2006/picture">
                 <pic:pic>
                   <pic:nvPicPr>
-                    <pic:cNvPr descr="images/training-hierarchical-csv/03-menu.png" id="30" name="Picture"/>
+                    <pic:cNvPr descr="images/training-hierarchical-csv/03-menu.png" id="31" name="Picture"/>
                     <pic:cNvPicPr>
                       <a:picLocks noChangeArrowheads="1" noChangeAspect="1"/>
                     </pic:cNvPicPr>
                   </pic:nvPicPr>
                   <pic:blipFill>
-                    <a:blip r:embed="rId28"/>
+                    <a:blip r:embed="rId29"/>
                     <a:stretch>
                       <a:fillRect/>
                     </a:stretch>
@@ -1663,18 +1674,18 @@
           <wp:inline>
             <wp:extent cx="5778500" cy="3250406"/>
             <wp:effectExtent b="0" l="0" r="0" t="0"/>
-            <wp:docPr descr="Ingest Settings with sector, standard and repository chosen." title="" id="32" name="Picture"/>
+            <wp:docPr descr="Ingest Settings with sector, standard and repository chosen." title="" id="33" name="Picture"/>
             <a:graphic>
               <a:graphicData uri="http://schemas.openxmlformats.org/drawingml/2006/picture">
                 <pic:pic>
                   <pic:nvPicPr>
-                    <pic:cNvPr descr="images/training-hierarchical-csv/04-configure.png" id="33" name="Picture"/>
+                    <pic:cNvPr descr="images/training-hierarchical-csv/04-configure.png" id="34" name="Picture"/>
                     <pic:cNvPicPr>
                       <a:picLocks noChangeArrowheads="1" noChangeAspect="1"/>
                     </pic:cNvPicPr>
                   </pic:nvPicPr>
                   <pic:blipFill>
-                    <a:blip r:embed="rId31"/>
+                    <a:blip r:embed="rId32"/>
                     <a:stretch>
                       <a:fillRect/>
                     </a:stretch>
@@ -1774,18 +1785,18 @@
           <wp:inline>
             <wp:extent cx="5778500" cy="3250406"/>
             <wp:effectExtent b="0" l="0" r="0" t="0"/>
-            <wp:docPr descr="Hierarchy Placement: Use hierarchy from CSV." title="" id="35" name="Picture"/>
+            <wp:docPr descr="Hierarchy Placement: Use hierarchy from CSV." title="" id="36" name="Picture"/>
             <a:graphic>
               <a:graphicData uri="http://schemas.openxmlformats.org/drawingml/2006/picture">
                 <pic:pic>
                   <pic:nvPicPr>
-                    <pic:cNvPr descr="images/training-hierarchical-csv/05-placement.png" id="36" name="Picture"/>
+                    <pic:cNvPr descr="images/training-hierarchical-csv/05-placement.png" id="37" name="Picture"/>
                     <pic:cNvPicPr>
                       <a:picLocks noChangeArrowheads="1" noChangeAspect="1"/>
                     </pic:cNvPicPr>
                   </pic:nvPicPr>
                   <pic:blipFill>
-                    <a:blip r:embed="rId34"/>
+                    <a:blip r:embed="rId35"/>
                     <a:stretch>
                       <a:fillRect/>
                     </a:stretch>
@@ -1845,8 +1856,8 @@
         <w:t xml:space="preserve">.</w:t>
       </w:r>
     </w:p>
-    <w:bookmarkEnd w:id="37"/>
-    <w:bookmarkStart w:id="41" w:name="upload-the-file"/>
+    <w:bookmarkEnd w:id="38"/>
+    <w:bookmarkStart w:id="42" w:name="upload-the-file"/>
     <w:p>
       <w:pPr>
         <w:pStyle w:val="Heading2"/>
@@ -1898,18 +1909,18 @@
           <wp:inline>
             <wp:extent cx="5778500" cy="3250406"/>
             <wp:effectExtent b="0" l="0" r="0" t="0"/>
-            <wp:docPr descr="Upload Files, with the practice file chosen." title="" id="39" name="Picture"/>
+            <wp:docPr descr="Upload Files, with the practice file chosen." title="" id="40" name="Picture"/>
             <a:graphic>
               <a:graphicData uri="http://schemas.openxmlformats.org/drawingml/2006/picture">
                 <pic:pic>
                   <pic:nvPicPr>
-                    <pic:cNvPr descr="images/training-hierarchical-csv/06-upload.png" id="40" name="Picture"/>
+                    <pic:cNvPr descr="images/training-hierarchical-csv/06-upload.png" id="41" name="Picture"/>
                     <pic:cNvPicPr>
                       <a:picLocks noChangeArrowheads="1" noChangeAspect="1"/>
                     </pic:cNvPicPr>
                   </pic:nvPicPr>
                   <pic:blipFill>
-                    <a:blip r:embed="rId38"/>
+                    <a:blip r:embed="rId39"/>
                     <a:stretch>
                       <a:fillRect/>
                     </a:stretch>
@@ -1944,8 +1955,8 @@
         <w:t xml:space="preserve">Upload Files, with the practice file chosen.</w:t>
       </w:r>
     </w:p>
-    <w:bookmarkEnd w:id="41"/>
-    <w:bookmarkStart w:id="45" w:name="check-the-mapping"/>
+    <w:bookmarkEnd w:id="42"/>
+    <w:bookmarkStart w:id="46" w:name="check-the-mapping"/>
     <w:p>
       <w:pPr>
         <w:pStyle w:val="Heading2"/>
@@ -2011,18 +2022,18 @@
           <wp:inline>
             <wp:extent cx="5778500" cy="3250406"/>
             <wp:effectExtent b="0" l="0" r="0" t="0"/>
-            <wp:docPr descr="Column Mapping: each column paired with its AtoM field." title="" id="43" name="Picture"/>
+            <wp:docPr descr="Column Mapping: each column paired with its AtoM field." title="" id="44" name="Picture"/>
             <a:graphic>
               <a:graphicData uri="http://schemas.openxmlformats.org/drawingml/2006/picture">
                 <pic:pic>
                   <pic:nvPicPr>
-                    <pic:cNvPr descr="images/training-hierarchical-csv/07-map.png" id="44" name="Picture"/>
+                    <pic:cNvPr descr="images/training-hierarchical-csv/07-map.png" id="45" name="Picture"/>
                     <pic:cNvPicPr>
                       <a:picLocks noChangeArrowheads="1" noChangeAspect="1"/>
                     </pic:cNvPicPr>
                   </pic:nvPicPr>
                   <pic:blipFill>
-                    <a:blip r:embed="rId42"/>
+                    <a:blip r:embed="rId43"/>
                     <a:stretch>
                       <a:fillRect/>
                     </a:stretch>
@@ -2078,8 +2089,8 @@
         <w:t xml:space="preserve">.</w:t>
       </w:r>
     </w:p>
-    <w:bookmarkEnd w:id="45"/>
-    <w:bookmarkStart w:id="55" w:name="validate-and-fix-errors"/>
+    <w:bookmarkEnd w:id="46"/>
+    <w:bookmarkStart w:id="56" w:name="validate-and-fix-errors"/>
     <w:p>
       <w:pPr>
         <w:pStyle w:val="Heading2"/>
@@ -2105,18 +2116,18 @@
           <wp:inline>
             <wp:extent cx="5778500" cy="3250406"/>
             <wp:effectExtent b="0" l="0" r="0" t="0"/>
-            <wp:docPr descr="Validation Report: 6 valid, 1 error, and the issue on row 7." title="" id="47" name="Picture"/>
+            <wp:docPr descr="Validation Report: 6 valid, 1 error, and the issue on row 7." title="" id="48" name="Picture"/>
             <a:graphic>
               <a:graphicData uri="http://schemas.openxmlformats.org/drawingml/2006/picture">
                 <pic:pic>
                   <pic:nvPicPr>
-                    <pic:cNvPr descr="images/training-hierarchical-csv/08-validate.png" id="48" name="Picture"/>
+                    <pic:cNvPr descr="images/training-hierarchical-csv/08-validate.png" id="49" name="Picture"/>
                     <pic:cNvPicPr>
                       <a:picLocks noChangeArrowheads="1" noChangeAspect="1"/>
                     </pic:cNvPicPr>
                   </pic:nvPicPr>
                   <pic:blipFill>
-                    <a:blip r:embed="rId46"/>
+                    <a:blip r:embed="rId47"/>
                     <a:stretch>
                       <a:fillRect/>
                     </a:stretch>
@@ -2294,18 +2305,18 @@
           <wp:inline>
             <wp:extent cx="5778500" cy="3250406"/>
             <wp:effectExtent b="0" l="0" r="0" t="0"/>
-            <wp:docPr descr="The Fix Field Value dialog with GF-C entered." title="" id="50" name="Picture"/>
+            <wp:docPr descr="The Fix Field Value dialog with GF-C entered." title="" id="51" name="Picture"/>
             <a:graphic>
               <a:graphicData uri="http://schemas.openxmlformats.org/drawingml/2006/picture">
                 <pic:pic>
                   <pic:nvPicPr>
-                    <pic:cNvPr descr="images/training-hierarchical-csv/09-fix.png" id="51" name="Picture"/>
+                    <pic:cNvPr descr="images/training-hierarchical-csv/09-fix.png" id="52" name="Picture"/>
                     <pic:cNvPicPr>
                       <a:picLocks noChangeArrowheads="1" noChangeAspect="1"/>
                     </pic:cNvPicPr>
                   </pic:nvPicPr>
                   <pic:blipFill>
-                    <a:blip r:embed="rId49"/>
+                    <a:blip r:embed="rId50"/>
                     <a:stretch>
                       <a:fillRect/>
                     </a:stretch>
@@ -2357,18 +2368,18 @@
           <wp:inline>
             <wp:extent cx="5778500" cy="3250406"/>
             <wp:effectExtent b="0" l="0" r="0" t="0"/>
-            <wp:docPr descr="After the fix: 7 valid, 0 errors." title="" id="53" name="Picture"/>
+            <wp:docPr descr="After the fix: 7 valid, 0 errors." title="" id="54" name="Picture"/>
             <a:graphic>
               <a:graphicData uri="http://schemas.openxmlformats.org/drawingml/2006/picture">
                 <pic:pic>
                   <pic:nvPicPr>
-                    <pic:cNvPr descr="images/training-hierarchical-csv/10-revalidated.png" id="54" name="Picture"/>
+                    <pic:cNvPr descr="images/training-hierarchical-csv/10-revalidated.png" id="55" name="Picture"/>
                     <pic:cNvPicPr>
                       <a:picLocks noChangeArrowheads="1" noChangeAspect="1"/>
                     </pic:cNvPicPr>
                   </pic:nvPicPr>
                   <pic:blipFill>
-                    <a:blip r:embed="rId52"/>
+                    <a:blip r:embed="rId53"/>
                     <a:stretch>
                       <a:fillRect/>
                     </a:stretch>
@@ -2638,8 +2649,8 @@
         </w:tc>
       </w:tr>
     </w:tbl>
-    <w:bookmarkEnd w:id="55"/>
-    <w:bookmarkStart w:id="62" w:name="preview-and-dry-run"/>
+    <w:bookmarkEnd w:id="56"/>
+    <w:bookmarkStart w:id="63" w:name="preview-and-dry-run"/>
     <w:p>
       <w:pPr>
         <w:pStyle w:val="Heading2"/>
@@ -2694,18 +2705,18 @@
           <wp:inline>
             <wp:extent cx="5778500" cy="3250406"/>
             <wp:effectExtent b="0" l="0" r="0" t="0"/>
-            <wp:docPr descr="Hierarchy Preview: the letters file under Correspondence." title="" id="57" name="Picture"/>
+            <wp:docPr descr="Hierarchy Preview: the letters file under Correspondence." title="" id="58" name="Picture"/>
             <a:graphic>
               <a:graphicData uri="http://schemas.openxmlformats.org/drawingml/2006/picture">
                 <pic:pic>
                   <pic:nvPicPr>
-                    <pic:cNvPr descr="images/training-hierarchical-csv/11-preview.png" id="58" name="Picture"/>
+                    <pic:cNvPr descr="images/training-hierarchical-csv/11-preview.png" id="59" name="Picture"/>
                     <pic:cNvPicPr>
                       <a:picLocks noChangeArrowheads="1" noChangeAspect="1"/>
                     </pic:cNvPicPr>
                   </pic:nvPicPr>
                   <pic:blipFill>
-                    <a:blip r:embed="rId56"/>
+                    <a:blip r:embed="rId57"/>
                     <a:stretch>
                       <a:fillRect/>
                     </a:stretch>
@@ -2773,18 +2784,18 @@
           <wp:inline>
             <wp:extent cx="5778500" cy="3250406"/>
             <wp:effectExtent b="0" l="0" r="0" t="0"/>
-            <wp:docPr descr="The dry-run report: order, action and where each record will be placed." title="" id="60" name="Picture"/>
+            <wp:docPr descr="The dry-run report: order, action and where each record will be placed." title="" id="61" name="Picture"/>
             <a:graphic>
               <a:graphicData uri="http://schemas.openxmlformats.org/drawingml/2006/picture">
                 <pic:pic>
                   <pic:nvPicPr>
-                    <pic:cNvPr descr="images/training-hierarchical-csv/12-dry-run.png" id="61" name="Picture"/>
+                    <pic:cNvPr descr="images/training-hierarchical-csv/12-dry-run.png" id="62" name="Picture"/>
                     <pic:cNvPicPr>
                       <a:picLocks noChangeArrowheads="1" noChangeAspect="1"/>
                     </pic:cNvPicPr>
                   </pic:nvPicPr>
                   <pic:blipFill>
-                    <a:blip r:embed="rId59"/>
+                    <a:blip r:embed="rId60"/>
                     <a:stretch>
                       <a:fillRect/>
                     </a:stretch>
@@ -2819,8 +2830,8 @@
         <w:t xml:space="preserve">The dry-run report: order, action and where each record will be placed.</w:t>
       </w:r>
     </w:p>
-    <w:bookmarkEnd w:id="62"/>
-    <w:bookmarkStart w:id="66" w:name="commit"/>
+    <w:bookmarkEnd w:id="63"/>
+    <w:bookmarkStart w:id="67" w:name="commit"/>
     <w:p>
       <w:pPr>
         <w:pStyle w:val="Heading2"/>
@@ -2880,18 +2891,18 @@
           <wp:inline>
             <wp:extent cx="5778500" cy="3250406"/>
             <wp:effectExtent b="0" l="0" r="0" t="0"/>
-            <wp:docPr descr="Ingest Completed: 7 records created, 0 errors." title="" id="64" name="Picture"/>
+            <wp:docPr descr="Ingest Completed: 7 records created, 0 errors." title="" id="65" name="Picture"/>
             <a:graphic>
               <a:graphicData uri="http://schemas.openxmlformats.org/drawingml/2006/picture">
                 <pic:pic>
                   <pic:nvPicPr>
-                    <pic:cNvPr descr="images/training-hierarchical-csv/13-completed.png" id="65" name="Picture"/>
+                    <pic:cNvPr descr="images/training-hierarchical-csv/13-completed.png" id="66" name="Picture"/>
                     <pic:cNvPicPr>
                       <a:picLocks noChangeArrowheads="1" noChangeAspect="1"/>
                     </pic:cNvPicPr>
                   </pic:nvPicPr>
                   <pic:blipFill>
-                    <a:blip r:embed="rId63"/>
+                    <a:blip r:embed="rId64"/>
                     <a:stretch>
                       <a:fillRect/>
                     </a:stretch>
@@ -2926,8 +2937,8 @@
         <w:t xml:space="preserve">Ingest Completed: 7 records created, 0 errors.</w:t>
       </w:r>
     </w:p>
-    <w:bookmarkEnd w:id="66"/>
-    <w:bookmarkStart w:id="73" w:name="check-the-result"/>
+    <w:bookmarkEnd w:id="67"/>
+    <w:bookmarkStart w:id="74" w:name="check-the-result"/>
     <w:p>
       <w:pPr>
         <w:pStyle w:val="Heading2"/>
@@ -3001,18 +3012,18 @@
           <wp:inline>
             <wp:extent cx="5778500" cy="3250406"/>
             <wp:effectExtent b="0" l="0" r="0" t="0"/>
-            <wp:docPr descr="Correspondence, with the letters file under it in the tree." title="" id="68" name="Picture"/>
+            <wp:docPr descr="Correspondence, with the letters file under it in the tree." title="" id="69" name="Picture"/>
             <a:graphic>
               <a:graphicData uri="http://schemas.openxmlformats.org/drawingml/2006/picture">
                 <pic:pic>
                   <pic:nvPicPr>
-                    <pic:cNvPr descr="images/training-hierarchical-csv/14-result.png" id="69" name="Picture"/>
+                    <pic:cNvPr descr="images/training-hierarchical-csv/14-result.png" id="70" name="Picture"/>
                     <pic:cNvPicPr>
                       <a:picLocks noChangeArrowheads="1" noChangeAspect="1"/>
                     </pic:cNvPicPr>
                   </pic:nvPicPr>
                   <pic:blipFill>
-                    <a:blip r:embed="rId67"/>
+                    <a:blip r:embed="rId68"/>
                     <a:stretch>
                       <a:fillRect/>
                     </a:stretch>
@@ -3084,18 +3095,18 @@
           <wp:inline>
             <wp:extent cx="5778500" cy="3250406"/>
             <wp:effectExtent b="0" l="0" r="0" t="0"/>
-            <wp:docPr descr="The (Draft) marker after the title." title="" id="71" name="Picture"/>
+            <wp:docPr descr="The (Draft) marker after the title." title="" id="72" name="Picture"/>
             <a:graphic>
               <a:graphicData uri="http://schemas.openxmlformats.org/drawingml/2006/picture">
                 <pic:pic>
                   <pic:nvPicPr>
-                    <pic:cNvPr descr="images/training-hierarchical-csv/15-draft.png" id="72" name="Picture"/>
+                    <pic:cNvPr descr="images/training-hierarchical-csv/15-draft.png" id="73" name="Picture"/>
                     <pic:cNvPicPr>
                       <a:picLocks noChangeArrowheads="1" noChangeAspect="1"/>
                     </pic:cNvPicPr>
                   </pic:nvPicPr>
                   <pic:blipFill>
-                    <a:blip r:embed="rId70"/>
+                    <a:blip r:embed="rId71"/>
                     <a:stretch>
                       <a:fillRect/>
                     </a:stretch>
@@ -3130,8 +3141,8 @@
         <w:t xml:space="preserve">The (Draft) marker after the title.</w:t>
       </w:r>
     </w:p>
-    <w:bookmarkEnd w:id="73"/>
-    <w:bookmarkStart w:id="74" w:name="recap"/>
+    <w:bookmarkEnd w:id="74"/>
+    <w:bookmarkStart w:id="75" w:name="recap"/>
     <w:p>
       <w:pPr>
         <w:pStyle w:val="Heading2"/>
@@ -3212,8 +3223,8 @@
         <w:t xml:space="preserve">Check the tree, then publish.</w:t>
       </w:r>
     </w:p>
-    <w:bookmarkEnd w:id="74"/>
-    <w:bookmarkStart w:id="75" w:name="cleaning-up"/>
+    <w:bookmarkEnd w:id="75"/>
+    <w:bookmarkStart w:id="76" w:name="cleaning-up"/>
     <w:p>
       <w:pPr>
         <w:pStyle w:val="Heading2"/>
@@ -3243,7 +3254,7 @@
         <w:t xml:space="preserve">. AtoM deletes the series, files and item under it as well.</w:t>
       </w:r>
     </w:p>
-    <w:bookmarkEnd w:id="75"/>
+    <w:bookmarkEnd w:id="76"/>
     <w:sectPr>
       <w:headerReference r:id="rId9" w:type="default"/>
       <w:footerReference r:id="rId10" w:type="default"/>

</xml_diff>